<commit_message>
Economía 2.º: Planes de Clase (27 planes, auditoría 100/100) y Plan Anual corregido
Planes formato V3 derivados del Plan Anual y de las fichas del tomo, 3 HC de 40 min,
índice poblado, un plan por hoja. Plan Anual: texto duplicado de las evaluaciones de
unidad corregido aguas arriba.

Co-Authored-By: Claude Opus 5.5 <noreply@anthropic.com>
Claude-Session: https://claude.ai/code/session_01PbDYVu4FEEwhgunWWJfqB4
</commit_message>
<xml_diff>
--- a/Pedido_2026-10-03_Edicion_Oficio/01_Economia_2do_Curso/Economia_2do_Curso_PLAN_ANUAL.docx
+++ b/Pedido_2026-10-03_Edicion_Oficio/01_Economia_2do_Curso/Economia_2do_Curso_PLAN_ANUAL.docx
@@ -659,7 +659,7 @@
                 <w:b w:val="0"/>
                 <w:sz w:val="17"/>
               </w:rPr>
-              <w:t>Tabla de maximización completada y verificada. Resolución escrita del desafío de diseño de una tabla propia. Evaluación de la Unidad 1. Evaluación de la unidad (fotocopiable).</w:t>
+              <w:t>Tabla de maximización completada y verificada. Resolución escrita del desafío de diseño de una tabla propia. Evaluación de la Unidad 1 (fotocopiable).</w:t>
             </w:r>
           </w:p>
         </w:tc>
@@ -975,7 +975,7 @@
                 <w:b w:val="0"/>
                 <w:sz w:val="17"/>
               </w:rPr>
-              <w:t>Planilla de costos explícitos e implícitos. Resolución del problema de alquiler alternativo. Evaluación de la Unidad 2. Evaluación de la unidad (fotocopiable).</w:t>
+              <w:t>Planilla de costos explícitos e implícitos. Resolución del problema de alquiler alternativo. Evaluación de la Unidad 2 (fotocopiable).</w:t>
             </w:r>
           </w:p>
         </w:tc>
@@ -1426,7 +1426,7 @@
                 <w:b w:val="0"/>
                 <w:sz w:val="17"/>
               </w:rPr>
-              <w:t>Gráfico del equilibrio con excedente y escasez señalados. Resolución del problema de temporada. Evaluación de la Unidad 3. Evaluación de la unidad (fotocopiable).</w:t>
+              <w:t>Gráfico del equilibrio con excedente y escasez señalados. Resolución del problema de temporada. Evaluación de la Unidad 3 (fotocopiable).</w:t>
             </w:r>
           </w:p>
         </w:tc>
@@ -2147,7 +2147,7 @@
                 <w:b w:val="0"/>
                 <w:sz w:val="17"/>
               </w:rPr>
-              <w:t>Ejercicios de elasticidad de oferta. Escala de elasticidades de actividades locales con justificación técnica. Evaluación de la Unidad 4. Evaluación integradora de la 1.ª etapa. Evaluación de la unidad (fotocopiable).</w:t>
+              <w:t>Ejercicios de elasticidad de oferta. Escala de elasticidades de actividades locales con justificación técnica. Evaluación de la Unidad 4 (fotocopiable).</w:t>
             </w:r>
           </w:p>
         </w:tc>
@@ -2879,7 +2879,7 @@
                 <w:b w:val="0"/>
                 <w:sz w:val="17"/>
               </w:rPr>
-              <w:t>Cálculo del excedente en dos escenarios. Estimación de la disposición a pagar propia. Evaluación de la Unidad 5. Evaluación de la unidad (fotocopiable).</w:t>
+              <w:t>Cálculo del excedente en dos escenarios. Estimación de la disposición a pagar propia. Evaluación de la Unidad 5 (fotocopiable).</w:t>
             </w:r>
           </w:p>
         </w:tc>
@@ -3600,7 +3600,7 @@
                 <w:b w:val="0"/>
                 <w:sz w:val="17"/>
               </w:rPr>
-              <w:t>Informe breve de la investigación. Ejercicios de clasificación de rendimientos de escala. Evaluación de la Unidad 6. Evaluación de la unidad (fotocopiable).</w:t>
+              <w:t>Informe breve de la investigación. Ejercicios de clasificación de rendimientos de escala. Evaluación de la Unidad 6 (fotocopiable).</w:t>
             </w:r>
           </w:p>
         </w:tc>
@@ -4051,7 +4051,7 @@
                 <w:b w:val="0"/>
                 <w:sz w:val="17"/>
               </w:rPr>
-              <w:t>Ejercicios conceptuales sobre imperfecciones de la demanda. Análisis escrito de un caso local. Evaluación de la Unidad 7. Evaluación integradora de la 2.ª etapa. Evaluación de la unidad (fotocopiable).</w:t>
+              <w:t>Ejercicios conceptuales sobre imperfecciones de la demanda. Análisis escrito de un caso local. Evaluación de la Unidad 7 (fotocopiable).</w:t>
             </w:r>
           </w:p>
         </w:tc>

</xml_diff>